<commit_message>
Assets API docs final
</commit_message>
<xml_diff>
--- a/KT_Sessions_Technical/00_Deliverables/Assets_API/SHRSS_AEM_Assets_API_Comparison_Guide.docx
+++ b/KT_Sessions_Technical/00_Deliverables/Assets_API/SHRSS_AEM_Assets_API_Comparison_Guide.docx
@@ -4,14 +4,25 @@
   <w:body>
     <w:p>
       <w:pPr>
-        <w:pStyle w:val="Title"/>
-        <w:rPr>
-          <w:rFonts w:ascii="Aptos" w:hAnsi="Aptos" w:cstheme="minorBidi"/>
-          <w:sz w:val="21"/>
-          <w:szCs w:val="22"/>
-        </w:rPr>
-      </w:pPr>
-      <w:r>
+        <w:pStyle w:val="Compact"/>
+        <w:rPr>
+          <w:rFonts w:ascii="Adobe Clean ExtraBold" w:hAnsi="Adobe Clean ExtraBold"/>
+          <w:b/>
+          <w:bCs/>
+          <w:color w:val="FA1000"/>
+          <w:sz w:val="48"/>
+          <w:szCs w:val="48"/>
+        </w:rPr>
+      </w:pPr>
+      <w:r>
+        <w:rPr>
+          <w:rFonts w:ascii="Adobe Clean ExtraBold" w:hAnsi="Adobe Clean ExtraBold"/>
+          <w:b/>
+          <w:bCs/>
+          <w:color w:val="FA1000"/>
+          <w:sz w:val="48"/>
+          <w:szCs w:val="48"/>
+        </w:rPr>
         <w:t>SHRSS – AEM Assets API Comparison Guide</w:t>
       </w:r>
     </w:p>
@@ -2752,11 +2763,19 @@
     <w:p>
       <w:pPr>
         <w:pStyle w:val="FirstParagraph"/>
-      </w:pPr>
-      <w:r>
-        <w:rPr>
+        <w:rPr>
+          <w:rFonts w:ascii="Adobe Clean" w:hAnsi="Adobe Clean"/>
+          <w:sz w:val="24"/>
+          <w:szCs w:val="24"/>
+        </w:rPr>
+      </w:pPr>
+      <w:r>
+        <w:rPr>
+          <w:rFonts w:ascii="Adobe Clean" w:hAnsi="Adobe Clean"/>
           <w:i/>
           <w:iCs/>
+          <w:sz w:val="24"/>
+          <w:szCs w:val="24"/>
         </w:rPr>
         <w:t>Classic Assets HTTP API vs OpenAPI-based Assets APIs</w:t>
       </w:r>
@@ -2764,18 +2783,36 @@
     <w:p>
       <w:pPr>
         <w:pStyle w:val="BodyText"/>
-      </w:pPr>
-      <w:r>
+        <w:rPr>
+          <w:rFonts w:ascii="Adobe Clean" w:hAnsi="Adobe Clean"/>
+          <w:sz w:val="24"/>
+          <w:szCs w:val="24"/>
+        </w:rPr>
+      </w:pPr>
+      <w:r>
+        <w:rPr>
+          <w:rFonts w:ascii="Adobe Clean" w:hAnsi="Adobe Clean"/>
+          <w:sz w:val="24"/>
+          <w:szCs w:val="24"/>
+        </w:rPr>
         <w:t xml:space="preserve">Audience: </w:t>
       </w:r>
       <w:r>
         <w:rPr>
+          <w:rFonts w:ascii="Adobe Clean" w:hAnsi="Adobe Clean"/>
           <w:b/>
           <w:bCs/>
+          <w:sz w:val="24"/>
+          <w:szCs w:val="24"/>
         </w:rPr>
         <w:t>SHRSS Technical Lead / Senior Architect</w:t>
       </w:r>
       <w:r>
+        <w:rPr>
+          <w:rFonts w:ascii="Adobe Clean" w:hAnsi="Adobe Clean"/>
+          <w:sz w:val="24"/>
+          <w:szCs w:val="24"/>
+        </w:rPr>
         <w:t xml:space="preserve"> Scope: Using AEM APIs to perform folder and asset CRUD under:</w:t>
       </w:r>
     </w:p>
@@ -2786,20 +2823,36 @@
           <w:ilvl w:val="0"/>
           <w:numId w:val="11"/>
         </w:numPr>
-      </w:pPr>
-      <w:r>
-        <w:rPr>
+        <w:rPr>
+          <w:rFonts w:ascii="Adobe Clean" w:hAnsi="Adobe Clean"/>
+          <w:sz w:val="24"/>
+          <w:szCs w:val="24"/>
+        </w:rPr>
+      </w:pPr>
+      <w:r>
+        <w:rPr>
+          <w:rFonts w:ascii="Adobe Clean" w:hAnsi="Adobe Clean"/>
           <w:b/>
           <w:bCs/>
+          <w:sz w:val="24"/>
+          <w:szCs w:val="24"/>
         </w:rPr>
         <w:t>Stage author</w:t>
       </w:r>
       <w:r>
+        <w:rPr>
+          <w:rFonts w:ascii="Adobe Clean" w:hAnsi="Adobe Clean"/>
+          <w:sz w:val="24"/>
+          <w:szCs w:val="24"/>
+        </w:rPr>
         <w:t xml:space="preserve">: </w:t>
       </w:r>
       <w:r>
         <w:rPr>
           <w:rStyle w:val="VerbatimChar"/>
+          <w:rFonts w:ascii="Adobe Clean" w:hAnsi="Adobe Clean"/>
+          <w:sz w:val="24"/>
+          <w:szCs w:val="24"/>
         </w:rPr>
         <w:t>https://author-p135156-e1336256.adobeaemcloud.com</w:t>
       </w:r>
@@ -2811,20 +2864,36 @@
           <w:ilvl w:val="0"/>
           <w:numId w:val="11"/>
         </w:numPr>
-      </w:pPr>
-      <w:r>
-        <w:rPr>
+        <w:rPr>
+          <w:rFonts w:ascii="Adobe Clean" w:hAnsi="Adobe Clean"/>
+          <w:sz w:val="24"/>
+          <w:szCs w:val="24"/>
+        </w:rPr>
+      </w:pPr>
+      <w:r>
+        <w:rPr>
+          <w:rFonts w:ascii="Adobe Clean" w:hAnsi="Adobe Clean"/>
           <w:b/>
           <w:bCs/>
+          <w:sz w:val="24"/>
+          <w:szCs w:val="24"/>
         </w:rPr>
         <w:t>Base DAM folder</w:t>
       </w:r>
       <w:r>
+        <w:rPr>
+          <w:rFonts w:ascii="Adobe Clean" w:hAnsi="Adobe Clean"/>
+          <w:sz w:val="24"/>
+          <w:szCs w:val="24"/>
+        </w:rPr>
         <w:t xml:space="preserve">: </w:t>
       </w:r>
       <w:r>
         <w:rPr>
           <w:rStyle w:val="VerbatimChar"/>
+          <w:rFonts w:ascii="Adobe Clean" w:hAnsi="Adobe Clean"/>
+          <w:sz w:val="24"/>
+          <w:szCs w:val="24"/>
         </w:rPr>
         <w:t>/content/dam/shrss/corporate/photography</w:t>
       </w:r>
@@ -2832,8 +2901,18 @@
     <w:p>
       <w:pPr>
         <w:pStyle w:val="FirstParagraph"/>
-      </w:pPr>
-      <w:r>
+        <w:rPr>
+          <w:rFonts w:ascii="Adobe Clean" w:hAnsi="Adobe Clean"/>
+          <w:sz w:val="24"/>
+          <w:szCs w:val="24"/>
+        </w:rPr>
+      </w:pPr>
+      <w:r>
+        <w:rPr>
+          <w:rFonts w:ascii="Adobe Clean" w:hAnsi="Adobe Clean"/>
+          <w:sz w:val="24"/>
+          <w:szCs w:val="24"/>
+        </w:rPr>
         <w:t>This guide compares and documents two approaches:</w:t>
       </w:r>
     </w:p>
@@ -2844,24 +2923,45 @@
           <w:ilvl w:val="0"/>
           <w:numId w:val="12"/>
         </w:numPr>
-      </w:pPr>
-      <w:r>
-        <w:rPr>
+        <w:rPr>
+          <w:rFonts w:ascii="Adobe Clean" w:hAnsi="Adobe Clean"/>
+          <w:sz w:val="24"/>
+          <w:szCs w:val="24"/>
+        </w:rPr>
+      </w:pPr>
+      <w:r>
+        <w:rPr>
+          <w:rFonts w:ascii="Adobe Clean" w:hAnsi="Adobe Clean"/>
           <w:b/>
           <w:bCs/>
+          <w:sz w:val="24"/>
+          <w:szCs w:val="24"/>
         </w:rPr>
         <w:t>Classic Assets HTTP API + Direct Binary Upload</w:t>
       </w:r>
       <w:r>
+        <w:rPr>
+          <w:rFonts w:ascii="Adobe Clean" w:hAnsi="Adobe Clean"/>
+          <w:sz w:val="24"/>
+          <w:szCs w:val="24"/>
+        </w:rPr>
         <w:t xml:space="preserve"> (path-based </w:t>
       </w:r>
       <w:r>
         <w:rPr>
           <w:rStyle w:val="VerbatimChar"/>
+          <w:rFonts w:ascii="Adobe Clean" w:hAnsi="Adobe Clean"/>
+          <w:sz w:val="24"/>
+          <w:szCs w:val="24"/>
         </w:rPr>
         <w:t>/api/assets</w:t>
       </w:r>
       <w:r>
+        <w:rPr>
+          <w:rFonts w:ascii="Adobe Clean" w:hAnsi="Adobe Clean"/>
+          <w:sz w:val="24"/>
+          <w:szCs w:val="24"/>
+        </w:rPr>
         <w:t>).</w:t>
       </w:r>
     </w:p>
@@ -2872,23 +2972,46 @@
           <w:ilvl w:val="0"/>
           <w:numId w:val="12"/>
         </w:numPr>
-      </w:pPr>
-      <w:r>
-        <w:rPr>
+        <w:rPr>
+          <w:rFonts w:ascii="Adobe Clean" w:hAnsi="Adobe Clean"/>
+          <w:sz w:val="24"/>
+          <w:szCs w:val="24"/>
+        </w:rPr>
+      </w:pPr>
+      <w:r>
+        <w:rPr>
+          <w:rFonts w:ascii="Adobe Clean" w:hAnsi="Adobe Clean"/>
           <w:b/>
           <w:bCs/>
+          <w:sz w:val="24"/>
+          <w:szCs w:val="24"/>
         </w:rPr>
         <w:t>OpenAPI-based AEM Assets Author API + Folders API</w:t>
       </w:r>
       <w:r>
+        <w:rPr>
+          <w:rFonts w:ascii="Adobe Clean" w:hAnsi="Adobe Clean"/>
+          <w:sz w:val="24"/>
+          <w:szCs w:val="24"/>
+        </w:rPr>
         <w:t xml:space="preserve"> (ID-based + path-based).</w:t>
       </w:r>
     </w:p>
     <w:p>
       <w:pPr>
         <w:pStyle w:val="FirstParagraph"/>
-      </w:pPr>
-      <w:r>
+        <w:rPr>
+          <w:rFonts w:ascii="Adobe Clean" w:hAnsi="Adobe Clean"/>
+          <w:sz w:val="24"/>
+          <w:szCs w:val="24"/>
+        </w:rPr>
+      </w:pPr>
+      <w:r>
+        <w:rPr>
+          <w:rFonts w:ascii="Adobe Clean" w:hAnsi="Adobe Clean"/>
+          <w:sz w:val="24"/>
+          <w:szCs w:val="24"/>
+        </w:rPr>
         <w:t>The same CRUD flows are covered for each:</w:t>
       </w:r>
     </w:p>
@@ -2899,8 +3022,18 @@
           <w:ilvl w:val="0"/>
           <w:numId w:val="13"/>
         </w:numPr>
-      </w:pPr>
-      <w:r>
+        <w:rPr>
+          <w:rFonts w:ascii="Adobe Clean" w:hAnsi="Adobe Clean"/>
+          <w:sz w:val="24"/>
+          <w:szCs w:val="24"/>
+        </w:rPr>
+      </w:pPr>
+      <w:r>
+        <w:rPr>
+          <w:rFonts w:ascii="Adobe Clean" w:hAnsi="Adobe Clean"/>
+          <w:sz w:val="24"/>
+          <w:szCs w:val="24"/>
+        </w:rPr>
         <w:t>List folder contents</w:t>
       </w:r>
     </w:p>
@@ -2911,8 +3044,18 @@
           <w:ilvl w:val="0"/>
           <w:numId w:val="13"/>
         </w:numPr>
-      </w:pPr>
-      <w:r>
+        <w:rPr>
+          <w:rFonts w:ascii="Adobe Clean" w:hAnsi="Adobe Clean"/>
+          <w:sz w:val="24"/>
+          <w:szCs w:val="24"/>
+        </w:rPr>
+      </w:pPr>
+      <w:r>
+        <w:rPr>
+          <w:rFonts w:ascii="Adobe Clean" w:hAnsi="Adobe Clean"/>
+          <w:sz w:val="24"/>
+          <w:szCs w:val="24"/>
+        </w:rPr>
         <w:t>Create folder</w:t>
       </w:r>
     </w:p>
@@ -2923,8 +3066,18 @@
           <w:ilvl w:val="0"/>
           <w:numId w:val="13"/>
         </w:numPr>
-      </w:pPr>
-      <w:r>
+        <w:rPr>
+          <w:rFonts w:ascii="Adobe Clean" w:hAnsi="Adobe Clean"/>
+          <w:sz w:val="24"/>
+          <w:szCs w:val="24"/>
+        </w:rPr>
+      </w:pPr>
+      <w:r>
+        <w:rPr>
+          <w:rFonts w:ascii="Adobe Clean" w:hAnsi="Adobe Clean"/>
+          <w:sz w:val="24"/>
+          <w:szCs w:val="24"/>
+        </w:rPr>
         <w:t>Create/import asset</w:t>
       </w:r>
     </w:p>
@@ -2935,8 +3088,18 @@
           <w:ilvl w:val="0"/>
           <w:numId w:val="13"/>
         </w:numPr>
-      </w:pPr>
-      <w:r>
+        <w:rPr>
+          <w:rFonts w:ascii="Adobe Clean" w:hAnsi="Adobe Clean"/>
+          <w:sz w:val="24"/>
+          <w:szCs w:val="24"/>
+        </w:rPr>
+      </w:pPr>
+      <w:r>
+        <w:rPr>
+          <w:rFonts w:ascii="Adobe Clean" w:hAnsi="Adobe Clean"/>
+          <w:sz w:val="24"/>
+          <w:szCs w:val="24"/>
+        </w:rPr>
         <w:t>Update asset metadata (and binary where applicable)</w:t>
       </w:r>
     </w:p>
@@ -2947,8 +3110,18 @@
           <w:ilvl w:val="0"/>
           <w:numId w:val="13"/>
         </w:numPr>
-      </w:pPr>
-      <w:r>
+        <w:rPr>
+          <w:rFonts w:ascii="Adobe Clean" w:hAnsi="Adobe Clean"/>
+          <w:sz w:val="24"/>
+          <w:szCs w:val="24"/>
+        </w:rPr>
+      </w:pPr>
+      <w:r>
+        <w:rPr>
+          <w:rFonts w:ascii="Adobe Clean" w:hAnsi="Adobe Clean"/>
+          <w:sz w:val="24"/>
+          <w:szCs w:val="24"/>
+        </w:rPr>
         <w:t>Delete asset and folder</w:t>
       </w:r>
     </w:p>
@@ -3433,7 +3606,11 @@
               <w:pStyle w:val="Compact"/>
             </w:pPr>
             <w:r>
-              <w:t>Asset metadata CRUD</w:t>
+              <w:t xml:space="preserve">Asset metadata </w:t>
+            </w:r>
+            <w:r>
+              <w:lastRenderedPageBreak/>
+              <w:t>CRUD</w:t>
             </w:r>
           </w:p>
         </w:tc>
@@ -3446,6 +3623,7 @@
               <w:pStyle w:val="Compact"/>
             </w:pPr>
             <w:r>
+              <w:lastRenderedPageBreak/>
               <w:t xml:space="preserve">Via </w:t>
             </w:r>
             <w:r>
@@ -3476,7 +3654,11 @@
               <w:t>Assets Author API</w:t>
             </w:r>
             <w:r>
-              <w:t xml:space="preserve"> (</w:t>
+              <w:t xml:space="preserve"> </w:t>
+            </w:r>
+            <w:r>
+              <w:lastRenderedPageBreak/>
+              <w:t>(</w:t>
             </w:r>
             <w:r>
               <w:rPr>
@@ -3500,11 +3682,8 @@
               <w:pStyle w:val="Compact"/>
             </w:pPr>
             <w:r>
-              <w:t>Tooling &amp; future-</w:t>
-            </w:r>
-            <w:r>
               <w:lastRenderedPageBreak/>
-              <w:t>proofing</w:t>
+              <w:t>Tooling &amp; future-proofing</w:t>
             </w:r>
           </w:p>
         </w:tc>
@@ -3517,12 +3696,7 @@
               <w:pStyle w:val="Compact"/>
             </w:pPr>
             <w:r>
-              <w:lastRenderedPageBreak/>
-              <w:t xml:space="preserve">Older, SIREN-based, still supported but not </w:t>
-            </w:r>
-            <w:r>
-              <w:lastRenderedPageBreak/>
-              <w:t>the long-term direction</w:t>
+              <w:t>Older, SIREN-based, still supported but not the long-term direction</w:t>
             </w:r>
           </w:p>
         </w:tc>
@@ -3535,12 +3709,7 @@
               <w:pStyle w:val="Compact"/>
             </w:pPr>
             <w:r>
-              <w:lastRenderedPageBreak/>
-              <w:t xml:space="preserve">OpenAPI (Swagger), SDK-friendly, modern </w:t>
-            </w:r>
-            <w:r>
-              <w:lastRenderedPageBreak/>
-              <w:t>error formats; long-term direction</w:t>
+              <w:t>OpenAPI (Swagger), SDK-friendly, modern error formats; long-term direction</w:t>
             </w:r>
           </w:p>
         </w:tc>
@@ -3555,7 +3724,6 @@
               <w:pStyle w:val="Compact"/>
             </w:pPr>
             <w:r>
-              <w:lastRenderedPageBreak/>
               <w:t>Recommendation</w:t>
             </w:r>
           </w:p>
@@ -3710,7 +3878,7 @@
     </w:p>
     <w:p>
       <w:r>
-        <w:pict w14:anchorId="7D182336">
+        <w:pict w14:anchorId="17B526C8">
           <v:rect id="Rectangle 89" o:spid="_x0000_s2071" alt="" style="width:496.8pt;height:1.1pt;visibility:visible;mso-wrap-style:square;mso-width-percent:0;mso-height-percent:0;mso-left-percent:-10001;mso-top-percent:-10001;mso-position-horizontal:absolute;mso-position-horizontal-relative:char;mso-position-vertical:absolute;mso-position-vertical-relative:line;mso-width-percent:0;mso-height-percent:0;mso-left-percent:-10001;mso-top-percent:-10001;v-text-anchor:top" filled="f">
             <o:lock v:ext="edit" aspectratio="t"/>
             <w10:anchorlock/>
@@ -3976,7 +4144,7 @@
     </w:p>
     <w:p>
       <w:r>
-        <w:pict w14:anchorId="52157584">
+        <w:pict w14:anchorId="66081B2B">
           <v:rect id="Rectangle 87" o:spid="_x0000_s2070" alt="" style="width:496.8pt;height:1.1pt;visibility:visible;mso-wrap-style:square;mso-width-percent:0;mso-height-percent:0;mso-left-percent:-10001;mso-top-percent:-10001;mso-position-horizontal:absolute;mso-position-horizontal-relative:char;mso-position-vertical:absolute;mso-position-vertical-relative:line;mso-width-percent:0;mso-height-percent:0;mso-left-percent:-10001;mso-top-percent:-10001;v-text-anchor:top" filled="f">
             <o:lock v:ext="edit" aspectratio="t"/>
             <w10:anchorlock/>
@@ -4149,7 +4317,7 @@
     </w:p>
     <w:p>
       <w:r>
-        <w:pict w14:anchorId="56199B47">
+        <w:pict w14:anchorId="4C5D9926">
           <v:rect id="Rectangle 85" o:spid="_x0000_s2069" alt="" style="width:496.8pt;height:1.1pt;visibility:visible;mso-wrap-style:square;mso-width-percent:0;mso-height-percent:0;mso-left-percent:-10001;mso-top-percent:-10001;mso-position-horizontal:absolute;mso-position-horizontal-relative:char;mso-position-vertical:absolute;mso-position-vertical-relative:line;mso-width-percent:0;mso-height-percent:0;mso-left-percent:-10001;mso-top-percent:-10001;v-text-anchor:top" filled="f">
             <o:lock v:ext="edit" aspectratio="t"/>
             <w10:anchorlock/>
@@ -4175,9 +4343,274 @@
     </w:p>
     <w:p>
       <w:pPr>
+        <w:shd w:val="clear" w:color="auto" w:fill="FFFFFF"/>
+        <w:spacing w:before="192" w:after="192" w:line="240" w:lineRule="auto"/>
+        <w:rPr>
+          <w:rFonts w:eastAsia="Times New Roman" w:cs="Open Sans"/>
+          <w:color w:val="333333"/>
+          <w:szCs w:val="24"/>
+        </w:rPr>
+      </w:pPr>
+      <w:r>
+        <w:rPr>
+          <w:rFonts w:eastAsia="Times New Roman" w:cs="Open Sans"/>
+          <w:b/>
+          <w:bCs/>
+          <w:color w:val="333333"/>
+          <w:szCs w:val="24"/>
+        </w:rPr>
+        <w:t>Important – JWT deprecation vs AEM Developer Console</w:t>
+      </w:r>
+    </w:p>
+    <w:p>
+      <w:pPr>
+        <w:numPr>
+          <w:ilvl w:val="0"/>
+          <w:numId w:val="54"/>
+        </w:numPr>
+        <w:shd w:val="clear" w:color="auto" w:fill="FFFFFF"/>
+        <w:spacing w:before="100" w:beforeAutospacing="1" w:after="100" w:afterAutospacing="1" w:line="240" w:lineRule="auto"/>
+        <w:rPr>
+          <w:rFonts w:eastAsia="Times New Roman" w:cs="Open Sans"/>
+          <w:color w:val="333333"/>
+          <w:szCs w:val="24"/>
+        </w:rPr>
+      </w:pPr>
+      <w:r>
+        <w:rPr>
+          <w:rFonts w:eastAsia="Times New Roman" w:cs="Open Sans"/>
+          <w:b/>
+          <w:bCs/>
+          <w:color w:val="333333"/>
+          <w:szCs w:val="24"/>
+        </w:rPr>
+        <w:t>Adobe Developer Console – Service Account (JWT)</w:t>
+      </w:r>
+      <w:r>
+        <w:rPr>
+          <w:rFonts w:eastAsia="Times New Roman" w:cs="Open Sans"/>
+          <w:color w:val="333333"/>
+          <w:szCs w:val="24"/>
+        </w:rPr>
+        <w:t xml:space="preserve"> credentials are deprecated and must be migrated to </w:t>
+      </w:r>
+      <w:r>
+        <w:rPr>
+          <w:rFonts w:eastAsia="Times New Roman" w:cs="Open Sans"/>
+          <w:b/>
+          <w:bCs/>
+          <w:color w:val="333333"/>
+          <w:szCs w:val="24"/>
+        </w:rPr>
+        <w:t>OAuth Server</w:t>
+      </w:r>
+      <w:r>
+        <w:rPr>
+          <w:rFonts w:eastAsia="Times New Roman" w:cs="Open Sans"/>
+          <w:b/>
+          <w:bCs/>
+          <w:color w:val="333333"/>
+          <w:szCs w:val="24"/>
+        </w:rPr>
+        <w:noBreakHyphen/>
+        <w:t>to</w:t>
+      </w:r>
+      <w:r>
+        <w:rPr>
+          <w:rFonts w:eastAsia="Times New Roman" w:cs="Open Sans"/>
+          <w:b/>
+          <w:bCs/>
+          <w:color w:val="333333"/>
+          <w:szCs w:val="24"/>
+        </w:rPr>
+        <w:noBreakHyphen/>
+        <w:t>Server</w:t>
+      </w:r>
+      <w:r>
+        <w:rPr>
+          <w:rFonts w:eastAsia="Times New Roman" w:cs="Open Sans"/>
+          <w:color w:val="333333"/>
+          <w:szCs w:val="24"/>
+        </w:rPr>
+        <w:t xml:space="preserve"> credentials. See </w:t>
+      </w:r>
+      <w:r>
+        <w:rPr>
+          <w:rFonts w:eastAsia="Times New Roman" w:cs="Open Sans"/>
+          <w:i/>
+          <w:iCs/>
+          <w:color w:val="333333"/>
+          <w:szCs w:val="24"/>
+        </w:rPr>
+        <w:t>"JWT Credentials Deprecation in Adobe Developer Console"</w:t>
+      </w:r>
+      <w:r>
+        <w:rPr>
+          <w:rFonts w:eastAsia="Times New Roman" w:cs="Open Sans"/>
+          <w:color w:val="333333"/>
+          <w:szCs w:val="24"/>
+        </w:rPr>
+        <w:t xml:space="preserve"> for details.</w:t>
+      </w:r>
+    </w:p>
+    <w:p>
+      <w:pPr>
+        <w:numPr>
+          <w:ilvl w:val="0"/>
+          <w:numId w:val="54"/>
+        </w:numPr>
+        <w:shd w:val="clear" w:color="auto" w:fill="FFFFFF"/>
+        <w:spacing w:before="100" w:beforeAutospacing="1" w:after="100" w:afterAutospacing="1" w:line="240" w:lineRule="auto"/>
+        <w:rPr>
+          <w:rFonts w:eastAsia="Times New Roman" w:cs="Open Sans"/>
+          <w:color w:val="333333"/>
+          <w:szCs w:val="24"/>
+        </w:rPr>
+      </w:pPr>
+      <w:r>
+        <w:rPr>
+          <w:rFonts w:eastAsia="Times New Roman" w:cs="Open Sans"/>
+          <w:color w:val="333333"/>
+          <w:szCs w:val="24"/>
+        </w:rPr>
+        <w:t xml:space="preserve">This guide's "classic" HTTP API examples use </w:t>
+      </w:r>
+      <w:r>
+        <w:rPr>
+          <w:rFonts w:eastAsia="Times New Roman" w:cs="Open Sans"/>
+          <w:b/>
+          <w:bCs/>
+          <w:color w:val="333333"/>
+          <w:szCs w:val="24"/>
+        </w:rPr>
+        <w:t>AEM Developer Console service credentials (technical account)</w:t>
+      </w:r>
+      <w:r>
+        <w:rPr>
+          <w:rFonts w:eastAsia="Times New Roman" w:cs="Open Sans"/>
+          <w:color w:val="333333"/>
+          <w:szCs w:val="24"/>
+        </w:rPr>
+        <w:t xml:space="preserve">, which internally generate a JWT to obtain an access token. </w:t>
+      </w:r>
+      <w:r>
+        <w:rPr>
+          <w:rFonts w:eastAsia="Times New Roman" w:cs="Open Sans"/>
+          <w:i/>
+          <w:iCs/>
+          <w:color w:val="333333"/>
+          <w:szCs w:val="24"/>
+        </w:rPr>
+        <w:t>These AEM Developer Console credentials are not deprecated and remain supported for AEM as a Cloud Service server</w:t>
+      </w:r>
+      <w:r>
+        <w:rPr>
+          <w:rFonts w:eastAsia="Times New Roman" w:cs="Open Sans"/>
+          <w:i/>
+          <w:iCs/>
+          <w:color w:val="333333"/>
+          <w:szCs w:val="24"/>
+        </w:rPr>
+        <w:noBreakHyphen/>
+        <w:t>to</w:t>
+      </w:r>
+      <w:r>
+        <w:rPr>
+          <w:rFonts w:eastAsia="Times New Roman" w:cs="Open Sans"/>
+          <w:i/>
+          <w:iCs/>
+          <w:color w:val="333333"/>
+          <w:szCs w:val="24"/>
+        </w:rPr>
+        <w:noBreakHyphen/>
+        <w:t>server access.</w:t>
+      </w:r>
+    </w:p>
+    <w:p>
+      <w:pPr>
+        <w:numPr>
+          <w:ilvl w:val="0"/>
+          <w:numId w:val="54"/>
+        </w:numPr>
+        <w:shd w:val="clear" w:color="auto" w:fill="FFFFFF"/>
+        <w:spacing w:before="100" w:beforeAutospacing="1" w:after="100" w:afterAutospacing="1" w:line="240" w:lineRule="auto"/>
+        <w:rPr>
+          <w:rFonts w:eastAsia="Times New Roman" w:cs="Open Sans"/>
+          <w:color w:val="333333"/>
+          <w:szCs w:val="24"/>
+        </w:rPr>
+      </w:pPr>
+      <w:r>
+        <w:rPr>
+          <w:rFonts w:eastAsia="Times New Roman" w:cs="Open Sans"/>
+          <w:color w:val="333333"/>
+          <w:szCs w:val="24"/>
+        </w:rPr>
+        <w:t xml:space="preserve">The OpenAPI examples in this guide use </w:t>
+      </w:r>
+      <w:r>
+        <w:rPr>
+          <w:rFonts w:eastAsia="Times New Roman" w:cs="Open Sans"/>
+          <w:b/>
+          <w:bCs/>
+          <w:color w:val="333333"/>
+          <w:szCs w:val="24"/>
+        </w:rPr>
+        <w:t>OAuth Server</w:t>
+      </w:r>
+      <w:r>
+        <w:rPr>
+          <w:rFonts w:eastAsia="Times New Roman" w:cs="Open Sans"/>
+          <w:b/>
+          <w:bCs/>
+          <w:color w:val="333333"/>
+          <w:szCs w:val="24"/>
+        </w:rPr>
+        <w:noBreakHyphen/>
+        <w:t>to</w:t>
+      </w:r>
+      <w:r>
+        <w:rPr>
+          <w:rFonts w:eastAsia="Times New Roman" w:cs="Open Sans"/>
+          <w:b/>
+          <w:bCs/>
+          <w:color w:val="333333"/>
+          <w:szCs w:val="24"/>
+        </w:rPr>
+        <w:noBreakHyphen/>
+        <w:t>Server</w:t>
+      </w:r>
+      <w:r>
+        <w:rPr>
+          <w:rFonts w:eastAsia="Times New Roman" w:cs="Open Sans"/>
+          <w:color w:val="333333"/>
+          <w:szCs w:val="24"/>
+        </w:rPr>
+        <w:t xml:space="preserve"> via Adobe Developer Console, which is the recommended pattern for OpenAPI</w:t>
+      </w:r>
+      <w:r>
+        <w:rPr>
+          <w:rFonts w:eastAsia="Times New Roman" w:cs="Open Sans"/>
+          <w:color w:val="333333"/>
+          <w:szCs w:val="24"/>
+        </w:rPr>
+        <w:noBreakHyphen/>
+        <w:t>based AEM APIs.</w:t>
+      </w:r>
+    </w:p>
+    <w:p>
+      <w:pPr>
         <w:pStyle w:val="FirstParagraph"/>
-      </w:pPr>
-      <w:r>
+        <w:rPr>
+          <w:sz w:val="24"/>
+          <w:szCs w:val="24"/>
+        </w:rPr>
+      </w:pPr>
+      <w:r>
+        <w:rPr>
+          <w:sz w:val="24"/>
+          <w:szCs w:val="24"/>
+        </w:rPr>
         <w:t>At a high level:</w:t>
       </w:r>
     </w:p>
@@ -4188,28 +4621,48 @@
           <w:ilvl w:val="0"/>
           <w:numId w:val="25"/>
         </w:numPr>
-      </w:pPr>
-      <w:r>
+        <w:rPr>
+          <w:sz w:val="24"/>
+          <w:szCs w:val="24"/>
+        </w:rPr>
+      </w:pPr>
+      <w:r>
+        <w:rPr>
+          <w:sz w:val="24"/>
+          <w:szCs w:val="24"/>
+        </w:rPr>
         <w:t xml:space="preserve">In </w:t>
       </w:r>
       <w:r>
         <w:rPr>
           <w:b/>
           <w:bCs/>
+          <w:sz w:val="24"/>
+          <w:szCs w:val="24"/>
         </w:rPr>
         <w:t>Cloud Manager</w:t>
       </w:r>
       <w:r>
+        <w:rPr>
+          <w:sz w:val="24"/>
+          <w:szCs w:val="24"/>
+        </w:rPr>
         <w:t xml:space="preserve">, open the </w:t>
       </w:r>
       <w:r>
         <w:rPr>
           <w:b/>
           <w:bCs/>
+          <w:sz w:val="24"/>
+          <w:szCs w:val="24"/>
         </w:rPr>
         <w:t>Developer Console</w:t>
       </w:r>
       <w:r>
+        <w:rPr>
+          <w:sz w:val="24"/>
+          <w:szCs w:val="24"/>
+        </w:rPr>
         <w:t xml:space="preserve"> for the target author environment.</w:t>
       </w:r>
     </w:p>
@@ -4220,28 +4673,48 @@
           <w:ilvl w:val="0"/>
           <w:numId w:val="25"/>
         </w:numPr>
-      </w:pPr>
-      <w:r>
+        <w:rPr>
+          <w:sz w:val="24"/>
+          <w:szCs w:val="24"/>
+        </w:rPr>
+      </w:pPr>
+      <w:r>
+        <w:rPr>
+          <w:sz w:val="24"/>
+          <w:szCs w:val="24"/>
+        </w:rPr>
         <w:t xml:space="preserve">Under </w:t>
       </w:r>
       <w:r>
         <w:rPr>
           <w:b/>
           <w:bCs/>
+          <w:sz w:val="24"/>
+          <w:szCs w:val="24"/>
         </w:rPr>
         <w:t>Tools → Integrations → Technical Accounts</w:t>
       </w:r>
       <w:r>
+        <w:rPr>
+          <w:sz w:val="24"/>
+          <w:szCs w:val="24"/>
+        </w:rPr>
         <w:t xml:space="preserve">, create a </w:t>
       </w:r>
       <w:r>
         <w:rPr>
           <w:b/>
           <w:bCs/>
+          <w:sz w:val="24"/>
+          <w:szCs w:val="24"/>
         </w:rPr>
         <w:t>technical account</w:t>
       </w:r>
       <w:r>
+        <w:rPr>
+          <w:sz w:val="24"/>
+          <w:szCs w:val="24"/>
+        </w:rPr>
         <w:t>.</w:t>
       </w:r>
     </w:p>
@@ -4252,36 +4725,62 @@
           <w:ilvl w:val="0"/>
           <w:numId w:val="25"/>
         </w:numPr>
-      </w:pPr>
-      <w:r>
+        <w:rPr>
+          <w:sz w:val="24"/>
+          <w:szCs w:val="24"/>
+        </w:rPr>
+      </w:pPr>
+      <w:r>
+        <w:rPr>
+          <w:sz w:val="24"/>
+          <w:szCs w:val="24"/>
+        </w:rPr>
         <w:t xml:space="preserve">Download the </w:t>
       </w:r>
       <w:r>
         <w:rPr>
           <w:b/>
           <w:bCs/>
+          <w:sz w:val="24"/>
+          <w:szCs w:val="24"/>
         </w:rPr>
         <w:t>service credentials JSON</w:t>
       </w:r>
       <w:r>
+        <w:rPr>
+          <w:sz w:val="24"/>
+          <w:szCs w:val="24"/>
+        </w:rPr>
         <w:t xml:space="preserve"> (contains </w:t>
       </w:r>
       <w:r>
         <w:rPr>
           <w:rStyle w:val="VerbatimChar"/>
+          <w:sz w:val="24"/>
+          <w:szCs w:val="24"/>
         </w:rPr>
         <w:t>client_id</w:t>
       </w:r>
       <w:r>
+        <w:rPr>
+          <w:sz w:val="24"/>
+          <w:szCs w:val="24"/>
+        </w:rPr>
         <w:t xml:space="preserve">, </w:t>
       </w:r>
       <w:r>
         <w:rPr>
           <w:rStyle w:val="VerbatimChar"/>
+          <w:sz w:val="24"/>
+          <w:szCs w:val="24"/>
         </w:rPr>
         <w:t>technical_account_id</w:t>
       </w:r>
       <w:r>
+        <w:rPr>
+          <w:sz w:val="24"/>
+          <w:szCs w:val="24"/>
+        </w:rPr>
         <w:t>, etc.).</w:t>
       </w:r>
     </w:p>
@@ -4292,18 +4791,32 @@
           <w:ilvl w:val="0"/>
           <w:numId w:val="25"/>
         </w:numPr>
-      </w:pPr>
-      <w:r>
+        <w:rPr>
+          <w:sz w:val="24"/>
+          <w:szCs w:val="24"/>
+        </w:rPr>
+      </w:pPr>
+      <w:r>
+        <w:rPr>
+          <w:sz w:val="24"/>
+          <w:szCs w:val="24"/>
+        </w:rPr>
         <w:t xml:space="preserve">Implement the </w:t>
       </w:r>
       <w:r>
         <w:rPr>
           <w:b/>
           <w:bCs/>
+          <w:sz w:val="24"/>
+          <w:szCs w:val="24"/>
         </w:rPr>
         <w:t>JWT → access token</w:t>
       </w:r>
       <w:r>
+        <w:rPr>
+          <w:sz w:val="24"/>
+          <w:szCs w:val="24"/>
+        </w:rPr>
         <w:t xml:space="preserve"> flow described here:</w:t>
       </w:r>
     </w:p>
@@ -4314,13 +4827,25 @@
           <w:ilvl w:val="1"/>
           <w:numId w:val="26"/>
         </w:numPr>
+        <w:rPr>
+          <w:sz w:val="24"/>
+          <w:szCs w:val="24"/>
+        </w:rPr>
       </w:pPr>
       <w:hyperlink r:id="rId9">
         <w:r>
+          <w:rPr>
+            <w:sz w:val="24"/>
+            <w:szCs w:val="24"/>
+          </w:rPr>
           <w:t>Generating Access Tokens for Server-Side APIs</w:t>
         </w:r>
       </w:hyperlink>
       <w:r>
+        <w:rPr>
+          <w:sz w:val="24"/>
+          <w:szCs w:val="24"/>
+        </w:rPr>
         <w:br/>
       </w:r>
     </w:p>
@@ -4331,9 +4856,17 @@
           <w:ilvl w:val="1"/>
           <w:numId w:val="26"/>
         </w:numPr>
+        <w:rPr>
+          <w:sz w:val="24"/>
+          <w:szCs w:val="24"/>
+        </w:rPr>
       </w:pPr>
       <w:hyperlink r:id="rId10">
         <w:r>
+          <w:rPr>
+            <w:sz w:val="24"/>
+            <w:szCs w:val="24"/>
+          </w:rPr>
           <w:t>How to obtain access tokens using AEM-CS API client code sample</w:t>
         </w:r>
       </w:hyperlink>
@@ -4345,125 +4878,195 @@
           <w:ilvl w:val="0"/>
           <w:numId w:val="25"/>
         </w:numPr>
-      </w:pPr>
-      <w:r>
+        <w:rPr>
+          <w:sz w:val="24"/>
+          <w:szCs w:val="24"/>
+        </w:rPr>
+      </w:pPr>
+      <w:r>
+        <w:rPr>
+          <w:sz w:val="24"/>
+          <w:szCs w:val="24"/>
+        </w:rPr>
         <w:t xml:space="preserve">Use the resulting </w:t>
       </w:r>
       <w:r>
         <w:rPr>
           <w:b/>
           <w:bCs/>
+          <w:sz w:val="24"/>
+          <w:szCs w:val="24"/>
         </w:rPr>
         <w:t>access token</w:t>
       </w:r>
       <w:r>
+        <w:rPr>
+          <w:sz w:val="24"/>
+          <w:szCs w:val="24"/>
+        </w:rPr>
         <w:t xml:space="preserve"> in requests as:</w:t>
       </w:r>
     </w:p>
     <w:p>
       <w:pPr>
         <w:pStyle w:val="SourceCode"/>
+        <w:rPr>
+          <w:sz w:val="24"/>
+          <w:szCs w:val="24"/>
+        </w:rPr>
       </w:pPr>
       <w:r>
         <w:rPr>
           <w:rStyle w:val="VerbatimChar"/>
-        </w:rPr>
+          <w:sz w:val="24"/>
+          <w:szCs w:val="24"/>
+        </w:rPr>
+        <w:lastRenderedPageBreak/>
         <w:t>Authorization: Bearer &lt;ACCESS_TOKEN&gt;</w:t>
       </w:r>
     </w:p>
     <w:p>
-      <w:r>
+      <w:pPr>
+        <w:rPr>
+          <w:szCs w:val="24"/>
+        </w:rPr>
+      </w:pPr>
+      <w:r>
+        <w:rPr>
+          <w:szCs w:val="24"/>
+        </w:rPr>
         <w:t xml:space="preserve">You can reuse the same technical account and token-generation code for both AEM author and </w:t>
       </w:r>
       <w:r>
         <w:rPr>
           <w:rStyle w:val="VerbatimChar"/>
+          <w:sz w:val="24"/>
+          <w:szCs w:val="24"/>
         </w:rPr>
         <w:t>/api/assets</w:t>
       </w:r>
       <w:r>
+        <w:rPr>
+          <w:szCs w:val="24"/>
+        </w:rPr>
         <w:t xml:space="preserve"> calls.</w:t>
       </w:r>
     </w:p>
     <w:p>
       <w:pPr>
         <w:pStyle w:val="FirstParagraph"/>
-      </w:pPr>
-      <w:r>
+        <w:rPr>
+          <w:sz w:val="24"/>
+          <w:szCs w:val="24"/>
+        </w:rPr>
+      </w:pPr>
+      <w:r>
+        <w:rPr>
+          <w:sz w:val="24"/>
+          <w:szCs w:val="24"/>
+        </w:rPr>
         <w:t>For examples below, assume:</w:t>
       </w:r>
     </w:p>
     <w:p>
       <w:pPr>
         <w:pStyle w:val="SourceCode"/>
+        <w:rPr>
+          <w:sz w:val="24"/>
+          <w:szCs w:val="24"/>
+        </w:rPr>
       </w:pPr>
       <w:r>
         <w:rPr>
           <w:rStyle w:val="BuiltInTok"/>
+          <w:sz w:val="24"/>
+          <w:szCs w:val="24"/>
         </w:rPr>
         <w:t>export</w:t>
       </w:r>
       <w:r>
         <w:rPr>
           <w:rStyle w:val="NormalTok"/>
+          <w:sz w:val="24"/>
+          <w:szCs w:val="24"/>
         </w:rPr>
         <w:t xml:space="preserve"> </w:t>
       </w:r>
       <w:r>
         <w:rPr>
           <w:rStyle w:val="VariableTok"/>
+          <w:sz w:val="24"/>
+          <w:szCs w:val="24"/>
         </w:rPr>
         <w:t>AEM_HOST</w:t>
       </w:r>
       <w:r>
         <w:rPr>
           <w:rStyle w:val="OperatorTok"/>
+          <w:sz w:val="24"/>
+          <w:szCs w:val="24"/>
         </w:rPr>
         <w:t>=</w:t>
       </w:r>
       <w:r>
         <w:rPr>
           <w:rStyle w:val="StringTok"/>
+          <w:sz w:val="24"/>
+          <w:szCs w:val="24"/>
         </w:rPr>
         <w:t>"https://author-p135156-e1336256.adobeaemcloud.com"</w:t>
       </w:r>
       <w:r>
+        <w:rPr>
+          <w:sz w:val="24"/>
+          <w:szCs w:val="24"/>
+        </w:rPr>
         <w:br/>
       </w:r>
       <w:r>
         <w:rPr>
           <w:rStyle w:val="BuiltInTok"/>
+          <w:sz w:val="24"/>
+          <w:szCs w:val="24"/>
         </w:rPr>
         <w:t>export</w:t>
       </w:r>
       <w:r>
         <w:rPr>
           <w:rStyle w:val="NormalTok"/>
+          <w:sz w:val="24"/>
+          <w:szCs w:val="24"/>
         </w:rPr>
         <w:t xml:space="preserve"> </w:t>
       </w:r>
       <w:r>
         <w:rPr>
           <w:rStyle w:val="VariableTok"/>
+          <w:sz w:val="24"/>
+          <w:szCs w:val="24"/>
         </w:rPr>
         <w:t>AUTH</w:t>
       </w:r>
       <w:r>
         <w:rPr>
           <w:rStyle w:val="OperatorTok"/>
+          <w:sz w:val="24"/>
+          <w:szCs w:val="24"/>
         </w:rPr>
         <w:t>=</w:t>
       </w:r>
       <w:r>
         <w:rPr>
           <w:rStyle w:val="StringTok"/>
+          <w:sz w:val="24"/>
+          <w:szCs w:val="24"/>
         </w:rPr>
         <w:t>"Authorization: Bearer &lt;ACCESS_TOKEN&gt;"</w:t>
       </w:r>
     </w:p>
     <w:p>
       <w:r>
-        <w:pict w14:anchorId="26D7F1FB">
+        <w:pict w14:anchorId="283A03DB">
           <v:rect id="Rectangle 83" o:spid="_x0000_s2068" alt="" style="width:496.8pt;height:1.1pt;visibility:visible;mso-wrap-style:square;mso-width-percent:0;mso-height-percent:0;mso-left-percent:-10001;mso-top-percent:-10001;mso-position-horizontal:absolute;mso-position-horizontal-relative:char;mso-position-vertical:absolute;mso-position-vertical-relative:line;mso-width-percent:0;mso-height-percent:0;mso-left-percent:-10001;mso-top-percent:-10001;v-text-anchor:top" filled="f">
             <o:lock v:ext="edit" aspectratio="t"/>
             <w10:anchorlock/>
@@ -4483,7 +5086,6 @@
       <w:bookmarkStart w:id="13" w:name="folder-asset-crud-via-assets-http-api"/>
       <w:bookmarkEnd w:id="11"/>
       <w:r>
-        <w:lastRenderedPageBreak/>
         <w:t>Folder &amp; asset CRUD via Assets HTTP API</w:t>
       </w:r>
       <w:bookmarkEnd w:id="12"/>
@@ -4641,7 +5243,7 @@
     </w:p>
     <w:p>
       <w:r>
-        <w:pict w14:anchorId="721198AB">
+        <w:pict w14:anchorId="6D3A8C45">
           <v:rect id="Rectangle 81" o:spid="_x0000_s2067" alt="" style="width:496.8pt;height:1.1pt;visibility:visible;mso-wrap-style:square;mso-width-percent:0;mso-height-percent:0;mso-left-percent:-10001;mso-top-percent:-10001;mso-position-horizontal:absolute;mso-position-horizontal-relative:char;mso-position-vertical:absolute;mso-position-vertical-relative:line;mso-width-percent:0;mso-height-percent:0;mso-left-percent:-10001;mso-top-percent:-10001;v-text-anchor:top" filled="f">
             <o:lock v:ext="edit" aspectratio="t"/>
             <w10:anchorlock/>
@@ -4942,6 +5544,7 @@
         <w:rPr>
           <w:rStyle w:val="ExtensionTok"/>
         </w:rPr>
+        <w:lastRenderedPageBreak/>
         <w:t>curl</w:t>
       </w:r>
       <w:r>
@@ -5049,7 +5652,7 @@
     </w:p>
     <w:p>
       <w:r>
-        <w:pict w14:anchorId="6A6FD147">
+        <w:pict w14:anchorId="665288B4">
           <v:rect id="Rectangle 79" o:spid="_x0000_s2066" alt="" style="width:496.8pt;height:1.1pt;visibility:visible;mso-wrap-style:square;mso-width-percent:0;mso-height-percent:0;mso-left-percent:-10001;mso-top-percent:-10001;mso-position-horizontal:absolute;mso-position-horizontal-relative:char;mso-position-vertical:absolute;mso-position-vertical-relative:line;mso-width-percent:0;mso-height-percent:0;mso-left-percent:-10001;mso-top-percent:-10001;v-text-anchor:top" filled="f">
             <o:lock v:ext="edit" aspectratio="t"/>
             <w10:anchorlock/>
@@ -5101,7 +5704,6 @@
           <w:b/>
           <w:bCs/>
         </w:rPr>
-        <w:lastRenderedPageBreak/>
         <w:t>Step 1 – Initiate upload</w:t>
       </w:r>
     </w:p>
@@ -5969,6 +6571,7 @@
         <w:rPr>
           <w:rStyle w:val="ExtensionTok"/>
         </w:rPr>
+        <w:lastRenderedPageBreak/>
         <w:t>curl</w:t>
       </w:r>
       <w:r>
@@ -6360,7 +6963,6 @@
         <w:pStyle w:val="FirstParagraph"/>
       </w:pPr>
       <w:r>
-        <w:lastRenderedPageBreak/>
         <w:t>Now you can retrieve the asset via:</w:t>
       </w:r>
     </w:p>
@@ -6511,7 +7113,7 @@
     </w:p>
     <w:p>
       <w:r>
-        <w:pict w14:anchorId="3DC31E55">
+        <w:pict w14:anchorId="4F7CCFC1">
           <v:rect id="Rectangle 77" o:spid="_x0000_s2065" alt="" style="width:496.8pt;height:1.1pt;visibility:visible;mso-wrap-style:square;mso-width-percent:0;mso-height-percent:0;mso-left-percent:-10001;mso-top-percent:-10001;mso-position-horizontal:absolute;mso-position-horizontal-relative:char;mso-position-vertical:absolute;mso-position-vertical-relative:line;mso-width-percent:0;mso-height-percent:0;mso-left-percent:-10001;mso-top-percent:-10001;v-text-anchor:top" filled="f">
             <o:lock v:ext="edit" aspectratio="t"/>
             <w10:anchorlock/>
@@ -6951,6 +7553,7 @@
         <w:rPr>
           <w:rStyle w:val="ExtensionTok"/>
         </w:rPr>
+        <w:lastRenderedPageBreak/>
         <w:t>curl</w:t>
       </w:r>
       <w:r>
@@ -7292,7 +7895,7 @@
     </w:p>
     <w:p>
       <w:r>
-        <w:pict w14:anchorId="54D0DAA6">
+        <w:pict w14:anchorId="38F147B2">
           <v:rect id="Rectangle 75" o:spid="_x0000_s2064" alt="" style="width:496.8pt;height:1.1pt;visibility:visible;mso-wrap-style:square;mso-width-percent:0;mso-height-percent:0;mso-left-percent:-10001;mso-top-percent:-10001;mso-position-horizontal:absolute;mso-position-horizontal-relative:char;mso-position-vertical:absolute;mso-position-vertical-relative:line;mso-width-percent:0;mso-height-percent:0;mso-left-percent:-10001;mso-top-percent:-10001;v-text-anchor:top" filled="f">
             <o:lock v:ext="edit" aspectratio="t"/>
             <w10:anchorlock/>
@@ -7336,7 +7939,6 @@
         <w:rPr>
           <w:rStyle w:val="ExtensionTok"/>
         </w:rPr>
-        <w:lastRenderedPageBreak/>
         <w:t>curl</w:t>
       </w:r>
       <w:r>
@@ -7829,7 +8431,7 @@
     </w:p>
     <w:p>
       <w:r>
-        <w:pict w14:anchorId="6888E0BB">
+        <w:pict w14:anchorId="0D475509">
           <v:rect id="Rectangle 73" o:spid="_x0000_s2063" alt="" style="width:496.8pt;height:1.1pt;visibility:visible;mso-wrap-style:square;mso-width-percent:0;mso-height-percent:0;mso-left-percent:-10001;mso-top-percent:-10001;mso-position-horizontal:absolute;mso-position-horizontal-relative:char;mso-position-vertical:absolute;mso-position-vertical-relative:line;mso-width-percent:0;mso-height-percent:0;mso-left-percent:-10001;mso-top-percent:-10001;v-text-anchor:top" filled="f">
             <o:lock v:ext="edit" aspectratio="t"/>
             <w10:anchorlock/>
@@ -7931,6 +8533,7 @@
         </w:numPr>
       </w:pPr>
       <w:r>
+        <w:lastRenderedPageBreak/>
         <w:t xml:space="preserve">You want to align with </w:t>
       </w:r>
       <w:r>
@@ -8010,7 +8613,7 @@
     </w:p>
     <w:p>
       <w:r>
-        <w:pict w14:anchorId="56AA1CCC">
+        <w:pict w14:anchorId="4FA08221">
           <v:rect id="Rectangle 71" o:spid="_x0000_s2062" alt="" style="width:496.8pt;height:1.1pt;visibility:visible;mso-wrap-style:square;mso-width-percent:0;mso-height-percent:0;mso-left-percent:-10001;mso-top-percent:-10001;mso-position-horizontal:absolute;mso-position-horizontal-relative:char;mso-position-vertical:absolute;mso-position-vertical-relative:line;mso-width-percent:0;mso-height-percent:0;mso-left-percent:-10001;mso-top-percent:-10001;v-text-anchor:top" filled="f">
             <o:lock v:ext="edit" aspectratio="t"/>
             <w10:anchorlock/>
@@ -8036,6 +8639,263 @@
     </w:p>
     <w:p>
       <w:pPr>
+        <w:shd w:val="clear" w:color="auto" w:fill="FFFFFF"/>
+        <w:spacing w:before="192" w:after="192" w:line="240" w:lineRule="auto"/>
+        <w:rPr>
+          <w:rFonts w:eastAsia="Times New Roman" w:cs="Open Sans"/>
+          <w:color w:val="333333"/>
+          <w:szCs w:val="24"/>
+        </w:rPr>
+      </w:pPr>
+      <w:r>
+        <w:rPr>
+          <w:rFonts w:eastAsia="Times New Roman" w:cs="Open Sans"/>
+          <w:b/>
+          <w:bCs/>
+          <w:color w:val="333333"/>
+          <w:szCs w:val="24"/>
+        </w:rPr>
+        <w:t>Important – JWT deprecation vs AEM Developer Console</w:t>
+      </w:r>
+    </w:p>
+    <w:p>
+      <w:pPr>
+        <w:numPr>
+          <w:ilvl w:val="0"/>
+          <w:numId w:val="54"/>
+        </w:numPr>
+        <w:shd w:val="clear" w:color="auto" w:fill="FFFFFF"/>
+        <w:spacing w:before="100" w:beforeAutospacing="1" w:after="100" w:afterAutospacing="1" w:line="240" w:lineRule="auto"/>
+        <w:rPr>
+          <w:rFonts w:eastAsia="Times New Roman" w:cs="Open Sans"/>
+          <w:color w:val="333333"/>
+          <w:szCs w:val="24"/>
+        </w:rPr>
+      </w:pPr>
+      <w:r>
+        <w:rPr>
+          <w:rFonts w:eastAsia="Times New Roman" w:cs="Open Sans"/>
+          <w:b/>
+          <w:bCs/>
+          <w:color w:val="333333"/>
+          <w:szCs w:val="24"/>
+        </w:rPr>
+        <w:t>Adobe Developer Console – Service Account (JWT)</w:t>
+      </w:r>
+      <w:r>
+        <w:rPr>
+          <w:rFonts w:eastAsia="Times New Roman" w:cs="Open Sans"/>
+          <w:color w:val="333333"/>
+          <w:szCs w:val="24"/>
+        </w:rPr>
+        <w:t xml:space="preserve"> credentials are deprecated and must be migrated to </w:t>
+      </w:r>
+      <w:r>
+        <w:rPr>
+          <w:rFonts w:eastAsia="Times New Roman" w:cs="Open Sans"/>
+          <w:b/>
+          <w:bCs/>
+          <w:color w:val="333333"/>
+          <w:szCs w:val="24"/>
+        </w:rPr>
+        <w:t>OAuth Server</w:t>
+      </w:r>
+      <w:r>
+        <w:rPr>
+          <w:rFonts w:eastAsia="Times New Roman" w:cs="Open Sans"/>
+          <w:b/>
+          <w:bCs/>
+          <w:color w:val="333333"/>
+          <w:szCs w:val="24"/>
+        </w:rPr>
+        <w:noBreakHyphen/>
+        <w:t>to</w:t>
+      </w:r>
+      <w:r>
+        <w:rPr>
+          <w:rFonts w:eastAsia="Times New Roman" w:cs="Open Sans"/>
+          <w:b/>
+          <w:bCs/>
+          <w:color w:val="333333"/>
+          <w:szCs w:val="24"/>
+        </w:rPr>
+        <w:noBreakHyphen/>
+        <w:t>Server</w:t>
+      </w:r>
+      <w:r>
+        <w:rPr>
+          <w:rFonts w:eastAsia="Times New Roman" w:cs="Open Sans"/>
+          <w:color w:val="333333"/>
+          <w:szCs w:val="24"/>
+        </w:rPr>
+        <w:t xml:space="preserve"> credentials. See </w:t>
+      </w:r>
+      <w:r>
+        <w:rPr>
+          <w:rFonts w:eastAsia="Times New Roman" w:cs="Open Sans"/>
+          <w:i/>
+          <w:iCs/>
+          <w:color w:val="333333"/>
+          <w:szCs w:val="24"/>
+        </w:rPr>
+        <w:t>"JWT Credentials Deprecation in Adobe Developer Console"</w:t>
+      </w:r>
+      <w:r>
+        <w:rPr>
+          <w:rFonts w:eastAsia="Times New Roman" w:cs="Open Sans"/>
+          <w:color w:val="333333"/>
+          <w:szCs w:val="24"/>
+        </w:rPr>
+        <w:t xml:space="preserve"> for details.</w:t>
+      </w:r>
+    </w:p>
+    <w:p>
+      <w:pPr>
+        <w:numPr>
+          <w:ilvl w:val="0"/>
+          <w:numId w:val="54"/>
+        </w:numPr>
+        <w:shd w:val="clear" w:color="auto" w:fill="FFFFFF"/>
+        <w:spacing w:before="100" w:beforeAutospacing="1" w:after="100" w:afterAutospacing="1" w:line="240" w:lineRule="auto"/>
+        <w:rPr>
+          <w:rFonts w:eastAsia="Times New Roman" w:cs="Open Sans"/>
+          <w:color w:val="333333"/>
+          <w:szCs w:val="24"/>
+        </w:rPr>
+      </w:pPr>
+      <w:r>
+        <w:rPr>
+          <w:rFonts w:eastAsia="Times New Roman" w:cs="Open Sans"/>
+          <w:color w:val="333333"/>
+          <w:szCs w:val="24"/>
+        </w:rPr>
+        <w:t xml:space="preserve">This guide's "classic" HTTP API examples use </w:t>
+      </w:r>
+      <w:r>
+        <w:rPr>
+          <w:rFonts w:eastAsia="Times New Roman" w:cs="Open Sans"/>
+          <w:b/>
+          <w:bCs/>
+          <w:color w:val="333333"/>
+          <w:szCs w:val="24"/>
+        </w:rPr>
+        <w:t>AEM Developer Console service credentials (technical account)</w:t>
+      </w:r>
+      <w:r>
+        <w:rPr>
+          <w:rFonts w:eastAsia="Times New Roman" w:cs="Open Sans"/>
+          <w:color w:val="333333"/>
+          <w:szCs w:val="24"/>
+        </w:rPr>
+        <w:t xml:space="preserve">, which internally generate a JWT to obtain an access token. </w:t>
+      </w:r>
+      <w:r>
+        <w:rPr>
+          <w:rFonts w:eastAsia="Times New Roman" w:cs="Open Sans"/>
+          <w:i/>
+          <w:iCs/>
+          <w:color w:val="333333"/>
+          <w:szCs w:val="24"/>
+        </w:rPr>
+        <w:t>These AEM Developer Console credentials are not deprecated and remain supported for AEM as a Cloud Service server</w:t>
+      </w:r>
+      <w:r>
+        <w:rPr>
+          <w:rFonts w:eastAsia="Times New Roman" w:cs="Open Sans"/>
+          <w:i/>
+          <w:iCs/>
+          <w:color w:val="333333"/>
+          <w:szCs w:val="24"/>
+        </w:rPr>
+        <w:noBreakHyphen/>
+        <w:t>to</w:t>
+      </w:r>
+      <w:r>
+        <w:rPr>
+          <w:rFonts w:eastAsia="Times New Roman" w:cs="Open Sans"/>
+          <w:i/>
+          <w:iCs/>
+          <w:color w:val="333333"/>
+          <w:szCs w:val="24"/>
+        </w:rPr>
+        <w:noBreakHyphen/>
+        <w:t>server access.</w:t>
+      </w:r>
+    </w:p>
+    <w:p>
+      <w:pPr>
+        <w:numPr>
+          <w:ilvl w:val="0"/>
+          <w:numId w:val="54"/>
+        </w:numPr>
+        <w:shd w:val="clear" w:color="auto" w:fill="FFFFFF"/>
+        <w:spacing w:before="100" w:beforeAutospacing="1" w:after="100" w:afterAutospacing="1" w:line="240" w:lineRule="auto"/>
+        <w:rPr>
+          <w:rFonts w:eastAsia="Times New Roman" w:cs="Open Sans"/>
+          <w:color w:val="333333"/>
+          <w:szCs w:val="24"/>
+        </w:rPr>
+      </w:pPr>
+      <w:r>
+        <w:rPr>
+          <w:rFonts w:eastAsia="Times New Roman" w:cs="Open Sans"/>
+          <w:color w:val="333333"/>
+          <w:szCs w:val="24"/>
+        </w:rPr>
+        <w:t xml:space="preserve">The OpenAPI examples in this guide use </w:t>
+      </w:r>
+      <w:r>
+        <w:rPr>
+          <w:rFonts w:eastAsia="Times New Roman" w:cs="Open Sans"/>
+          <w:b/>
+          <w:bCs/>
+          <w:color w:val="333333"/>
+          <w:szCs w:val="24"/>
+        </w:rPr>
+        <w:t>OAuth Server</w:t>
+      </w:r>
+      <w:r>
+        <w:rPr>
+          <w:rFonts w:eastAsia="Times New Roman" w:cs="Open Sans"/>
+          <w:b/>
+          <w:bCs/>
+          <w:color w:val="333333"/>
+          <w:szCs w:val="24"/>
+        </w:rPr>
+        <w:noBreakHyphen/>
+        <w:t>to</w:t>
+      </w:r>
+      <w:r>
+        <w:rPr>
+          <w:rFonts w:eastAsia="Times New Roman" w:cs="Open Sans"/>
+          <w:b/>
+          <w:bCs/>
+          <w:color w:val="333333"/>
+          <w:szCs w:val="24"/>
+        </w:rPr>
+        <w:noBreakHyphen/>
+        <w:t>Server</w:t>
+      </w:r>
+      <w:r>
+        <w:rPr>
+          <w:rFonts w:eastAsia="Times New Roman" w:cs="Open Sans"/>
+          <w:color w:val="333333"/>
+          <w:szCs w:val="24"/>
+        </w:rPr>
+        <w:t xml:space="preserve"> via Adobe Developer Console, which is the recommended pattern for OpenAPI</w:t>
+      </w:r>
+      <w:r>
+        <w:rPr>
+          <w:rFonts w:eastAsia="Times New Roman" w:cs="Open Sans"/>
+          <w:color w:val="333333"/>
+          <w:szCs w:val="24"/>
+        </w:rPr>
+        <w:noBreakHyphen/>
+        <w:t>based AEM APIs.</w:t>
+      </w:r>
+    </w:p>
+    <w:p>
+      <w:pPr>
         <w:pStyle w:val="FirstParagraph"/>
       </w:pPr>
       <w:r>
@@ -8061,7 +8921,6 @@
         </w:numPr>
       </w:pPr>
       <w:r>
-        <w:lastRenderedPageBreak/>
         <w:t xml:space="preserve">Create an </w:t>
       </w:r>
       <w:r>
@@ -8296,7 +9155,7 @@
     </w:p>
     <w:p>
       <w:r>
-        <w:pict w14:anchorId="35D5A70B">
+        <w:pict w14:anchorId="4910DCFB">
           <v:rect id="Rectangle 69" o:spid="_x0000_s2061" alt="" style="width:496.8pt;height:1.1pt;visibility:visible;mso-wrap-style:square;mso-width-percent:0;mso-height-percent:0;mso-left-percent:-10001;mso-top-percent:-10001;mso-position-horizontal:absolute;mso-position-horizontal-relative:char;mso-position-vertical:absolute;mso-position-vertical-relative:line;mso-width-percent:0;mso-height-percent:0;mso-left-percent:-10001;mso-top-percent:-10001;v-text-anchor:top" filled="f">
             <o:lock v:ext="edit" aspectratio="t"/>
             <w10:anchorlock/>
@@ -8316,6 +9175,7 @@
       <w:bookmarkStart w:id="31" w:name="Xbccc7eddca215cab477e19d5fdf7dc3fbb38b4e"/>
       <w:bookmarkEnd w:id="29"/>
       <w:r>
+        <w:lastRenderedPageBreak/>
         <w:t>Register the client in AEM via Cloud Manager</w:t>
       </w:r>
       <w:bookmarkEnd w:id="30"/>
@@ -8622,7 +9482,7 @@
     </w:p>
     <w:p>
       <w:r>
-        <w:pict w14:anchorId="7D15C8B5">
+        <w:pict w14:anchorId="2CFFAD29">
           <v:rect id="Rectangle 67" o:spid="_x0000_s2060" alt="" style="width:496.8pt;height:1.1pt;visibility:visible;mso-wrap-style:square;mso-width-percent:0;mso-height-percent:0;mso-left-percent:-10001;mso-top-percent:-10001;mso-position-horizontal:absolute;mso-position-horizontal-relative:char;mso-position-vertical:absolute;mso-position-vertical-relative:line;mso-width-percent:0;mso-height-percent:0;mso-left-percent:-10001;mso-top-percent:-10001;v-text-anchor:top" filled="f">
             <o:lock v:ext="edit" aspectratio="t"/>
             <w10:anchorlock/>
@@ -8707,7 +9567,6 @@
         </w:numPr>
       </w:pPr>
       <w:r>
-        <w:lastRenderedPageBreak/>
         <w:t>Ensure it has appropriate group membership (e.g. </w:t>
       </w:r>
       <w:r>
@@ -8742,7 +9601,7 @@
     </w:p>
     <w:p>
       <w:r>
-        <w:pict w14:anchorId="047950D4">
+        <w:pict w14:anchorId="03E7CD02">
           <v:rect id="Rectangle 65" o:spid="_x0000_s2059" alt="" style="width:496.8pt;height:1.1pt;visibility:visible;mso-wrap-style:square;mso-width-percent:0;mso-height-percent:0;mso-left-percent:-10001;mso-top-percent:-10001;mso-position-horizontal:absolute;mso-position-horizontal-relative:char;mso-position-vertical:absolute;mso-position-vertical-relative:line;mso-width-percent:0;mso-height-percent:0;mso-left-percent:-10001;mso-top-percent:-10001;v-text-anchor:top" filled="f">
             <o:lock v:ext="edit" aspectratio="t"/>
             <w10:anchorlock/>
@@ -9004,6 +9863,7 @@
         <w:pStyle w:val="FirstParagraph"/>
       </w:pPr>
       <w:r>
+        <w:lastRenderedPageBreak/>
         <w:t>Standard headers:</w:t>
       </w:r>
     </w:p>
@@ -9130,7 +9990,7 @@
     </w:p>
     <w:p>
       <w:r>
-        <w:pict w14:anchorId="018AD062">
+        <w:pict w14:anchorId="0469F742">
           <v:rect id="Rectangle 63" o:spid="_x0000_s2058" alt="" style="width:496.8pt;height:1.1pt;visibility:visible;mso-wrap-style:square;mso-width-percent:0;mso-height-percent:0;mso-left-percent:-10001;mso-top-percent:-10001;mso-position-horizontal:absolute;mso-position-horizontal-relative:char;mso-position-vertical:absolute;mso-position-vertical-relative:line;mso-width-percent:0;mso-height-percent:0;mso-left-percent:-10001;mso-top-percent:-10001;v-text-anchor:top" filled="f">
             <o:lock v:ext="edit" aspectratio="t"/>
             <w10:anchorlock/>
@@ -9431,7 +10291,6 @@
         <w:rPr>
           <w:rStyle w:val="VerbatimChar"/>
         </w:rPr>
-        <w:lastRenderedPageBreak/>
         <w:t>path</w:t>
       </w:r>
       <w:r>
@@ -9480,7 +10339,7 @@
     </w:p>
     <w:p>
       <w:r>
-        <w:pict w14:anchorId="04BC7B1A">
+        <w:pict w14:anchorId="150B625E">
           <v:rect id="Rectangle 61" o:spid="_x0000_s2057" alt="" style="width:496.8pt;height:1.1pt;visibility:visible;mso-wrap-style:square;mso-width-percent:0;mso-height-percent:0;mso-left-percent:-10001;mso-top-percent:-10001;mso-position-horizontal:absolute;mso-position-horizontal-relative:char;mso-position-vertical:absolute;mso-position-vertical-relative:line;mso-width-percent:0;mso-height-percent:0;mso-left-percent:-10001;mso-top-percent:-10001;v-text-anchor:top" filled="f">
             <o:lock v:ext="edit" aspectratio="t"/>
             <w10:anchorlock/>
@@ -9850,7 +10709,7 @@
     </w:p>
     <w:p>
       <w:r>
-        <w:pict w14:anchorId="30A87AA4">
+        <w:pict w14:anchorId="3FCA16B1">
           <v:rect id="Rectangle 59" o:spid="_x0000_s2056" alt="" style="width:496.8pt;height:1.1pt;visibility:visible;mso-wrap-style:square;mso-width-percent:0;mso-height-percent:0;mso-left-percent:-10001;mso-top-percent:-10001;mso-position-horizontal:absolute;mso-position-horizontal-relative:char;mso-position-vertical:absolute;mso-position-vertical-relative:line;mso-width-percent:0;mso-height-percent:0;mso-left-percent:-10001;mso-top-percent:-10001;v-text-anchor:top" filled="f">
             <o:lock v:ext="edit" aspectratio="t"/>
             <w10:anchorlock/>
@@ -9870,6 +10729,7 @@
       <w:bookmarkStart w:id="43" w:name="delete-a-folder-delete-folder"/>
       <w:bookmarkEnd w:id="41"/>
       <w:r>
+        <w:lastRenderedPageBreak/>
         <w:t>Delete a folder (Delete – folder)</w:t>
       </w:r>
       <w:bookmarkEnd w:id="42"/>
@@ -10394,7 +11254,7 @@
     </w:p>
     <w:p>
       <w:r>
-        <w:pict w14:anchorId="16F2A971">
+        <w:pict w14:anchorId="16CEB29D">
           <v:rect id="Rectangle 57" o:spid="_x0000_s2055" alt="" style="width:496.8pt;height:1.1pt;visibility:visible;mso-wrap-style:square;mso-width-percent:0;mso-height-percent:0;mso-left-percent:-10001;mso-top-percent:-10001;mso-position-horizontal:absolute;mso-position-horizontal-relative:char;mso-position-vertical:absolute;mso-position-vertical-relative:line;mso-width-percent:0;mso-height-percent:0;mso-left-percent:-10001;mso-top-percent:-10001;v-text-anchor:top" filled="f">
             <o:lock v:ext="edit" aspectratio="t"/>
             <w10:anchorlock/>
@@ -10415,7 +11275,6 @@
       <w:bookmarkEnd w:id="37"/>
       <w:bookmarkEnd w:id="43"/>
       <w:r>
-        <w:lastRenderedPageBreak/>
         <w:t>Asset CRUD via Assets Author API (OpenAPI)</w:t>
       </w:r>
       <w:bookmarkEnd w:id="44"/>
@@ -10851,6 +11710,7 @@
         <w:pStyle w:val="FirstParagraph"/>
       </w:pPr>
       <w:r>
+        <w:lastRenderedPageBreak/>
         <w:t>Then:</w:t>
       </w:r>
     </w:p>
@@ -10908,7 +11768,7 @@
     </w:p>
     <w:p>
       <w:r>
-        <w:pict w14:anchorId="11B39BF1">
+        <w:pict w14:anchorId="336F5699">
           <v:rect id="Rectangle 55" o:spid="_x0000_s2054" alt="" style="width:496.8pt;height:1.1pt;visibility:visible;mso-wrap-style:square;mso-width-percent:0;mso-height-percent:0;mso-left-percent:-10001;mso-top-percent:-10001;mso-position-horizontal:absolute;mso-position-horizontal-relative:char;mso-position-vertical:absolute;mso-position-vertical-relative:line;mso-width-percent:0;mso-height-percent:0;mso-left-percent:-10001;mso-top-percent:-10001;v-text-anchor:top" filled="f">
             <o:lock v:ext="edit" aspectratio="t"/>
             <w10:anchorlock/>
@@ -11422,7 +12282,6 @@
         <w:rPr>
           <w:rStyle w:val="StringTok"/>
         </w:rPr>
-        <w:lastRenderedPageBreak/>
         <w:t xml:space="preserve">      {</w:t>
       </w:r>
       <w:r>
@@ -11611,7 +12470,7 @@
     </w:p>
     <w:p>
       <w:r>
-        <w:pict w14:anchorId="15014C49">
+        <w:pict w14:anchorId="5B6E59B5">
           <v:rect id="Rectangle 53" o:spid="_x0000_s2053" alt="" style="width:496.8pt;height:1.1pt;visibility:visible;mso-wrap-style:square;mso-width-percent:0;mso-height-percent:0;mso-left-percent:-10001;mso-top-percent:-10001;mso-position-horizontal:absolute;mso-position-horizontal-relative:char;mso-position-vertical:absolute;mso-position-vertical-relative:line;mso-width-percent:0;mso-height-percent:0;mso-left-percent:-10001;mso-top-percent:-10001;v-text-anchor:top" filled="f">
             <o:lock v:ext="edit" aspectratio="t"/>
             <w10:anchorlock/>
@@ -11936,6 +12795,7 @@
         <w:rPr>
           <w:rStyle w:val="VerbatimChar"/>
         </w:rPr>
+        <w:lastRenderedPageBreak/>
         <w:t>repositoryMetadata</w:t>
       </w:r>
     </w:p>
@@ -11968,7 +12828,7 @@
     </w:p>
     <w:p>
       <w:r>
-        <w:pict w14:anchorId="69B269E9">
+        <w:pict w14:anchorId="06A56F65">
           <v:rect id="Rectangle 51" o:spid="_x0000_s2052" alt="" style="width:496.8pt;height:1.1pt;visibility:visible;mso-wrap-style:square;mso-width-percent:0;mso-height-percent:0;mso-left-percent:-10001;mso-top-percent:-10001;mso-position-horizontal:absolute;mso-position-horizontal-relative:char;mso-position-vertical:absolute;mso-position-vertical-relative:line;mso-width-percent:0;mso-height-percent:0;mso-left-percent:-10001;mso-top-percent:-10001;v-text-anchor:top" filled="f">
             <o:lock v:ext="edit" aspectratio="t"/>
             <w10:anchorlock/>
@@ -12368,7 +13228,7 @@
     </w:p>
     <w:p>
       <w:r>
-        <w:pict w14:anchorId="56B840B2">
+        <w:pict w14:anchorId="7F82C4B8">
           <v:rect id="Rectangle 49" o:spid="_x0000_s2051" alt="" style="width:496.8pt;height:1.1pt;visibility:visible;mso-wrap-style:square;mso-width-percent:0;mso-height-percent:0;mso-left-percent:-10001;mso-top-percent:-10001;mso-position-horizontal:absolute;mso-position-horizontal-relative:char;mso-position-vertical:absolute;mso-position-vertical-relative:line;mso-width-percent:0;mso-height-percent:0;mso-left-percent:-10001;mso-top-percent:-10001;v-text-anchor:top" filled="f">
             <o:lock v:ext="edit" aspectratio="t"/>
             <w10:anchorlock/>
@@ -12388,7 +13248,6 @@
       <w:bookmarkStart w:id="55" w:name="delete-an-asset-delete"/>
       <w:bookmarkEnd w:id="53"/>
       <w:r>
-        <w:lastRenderedPageBreak/>
         <w:t>Delete an asset (Delete)</w:t>
       </w:r>
       <w:bookmarkEnd w:id="54"/>
@@ -12591,7 +13450,7 @@
     </w:p>
     <w:p>
       <w:r>
-        <w:pict w14:anchorId="3563E691">
+        <w:pict w14:anchorId="093EA5B8">
           <v:rect id="Rectangle 47" o:spid="_x0000_s2050" alt="" style="width:496.8pt;height:1.1pt;visibility:visible;mso-wrap-style:square;mso-width-percent:0;mso-height-percent:0;mso-left-percent:-10001;mso-top-percent:-10001;mso-position-horizontal:absolute;mso-position-horizontal-relative:char;mso-position-vertical:absolute;mso-position-vertical-relative:line;mso-width-percent:0;mso-height-percent:0;mso-left-percent:-10001;mso-top-percent:-10001;v-text-anchor:top" filled="f">
             <o:lock v:ext="edit" aspectratio="t"/>
             <w10:anchorlock/>
@@ -12764,6 +13623,7 @@
         </w:numPr>
       </w:pPr>
       <w:r>
+        <w:lastRenderedPageBreak/>
         <w:t xml:space="preserve">Use </w:t>
       </w:r>
       <w:r>
@@ -13647,6 +14507,155 @@
     </w:lvl>
   </w:abstractNum>
   <w:abstractNum w:abstractNumId="14" w15:restartNumberingAfterBreak="0">
+    <w:nsid w:val="1BBE7560"/>
+    <w:multiLevelType w:val="multilevel"/>
+    <w:tmpl w:val="86F26A6E"/>
+    <w:lvl w:ilvl="0">
+      <w:start w:val="1"/>
+      <w:numFmt w:val="bullet"/>
+      <w:lvlText w:val=""/>
+      <w:lvlJc w:val="left"/>
+      <w:pPr>
+        <w:tabs>
+          <w:tab w:val="num" w:pos="720"/>
+        </w:tabs>
+        <w:ind w:left="720" w:hanging="360"/>
+      </w:pPr>
+      <w:rPr>
+        <w:rFonts w:ascii="Symbol" w:hAnsi="Symbol" w:hint="default"/>
+        <w:sz w:val="20"/>
+      </w:rPr>
+    </w:lvl>
+    <w:lvl w:ilvl="1" w:tentative="1">
+      <w:start w:val="1"/>
+      <w:numFmt w:val="bullet"/>
+      <w:lvlText w:val="o"/>
+      <w:lvlJc w:val="left"/>
+      <w:pPr>
+        <w:tabs>
+          <w:tab w:val="num" w:pos="1440"/>
+        </w:tabs>
+        <w:ind w:left="1440" w:hanging="360"/>
+      </w:pPr>
+      <w:rPr>
+        <w:rFonts w:ascii="Courier New" w:hAnsi="Courier New" w:hint="default"/>
+        <w:sz w:val="20"/>
+      </w:rPr>
+    </w:lvl>
+    <w:lvl w:ilvl="2" w:tentative="1">
+      <w:start w:val="1"/>
+      <w:numFmt w:val="bullet"/>
+      <w:lvlText w:val=""/>
+      <w:lvlJc w:val="left"/>
+      <w:pPr>
+        <w:tabs>
+          <w:tab w:val="num" w:pos="2160"/>
+        </w:tabs>
+        <w:ind w:left="2160" w:hanging="360"/>
+      </w:pPr>
+      <w:rPr>
+        <w:rFonts w:ascii="Wingdings" w:hAnsi="Wingdings" w:hint="default"/>
+        <w:sz w:val="20"/>
+      </w:rPr>
+    </w:lvl>
+    <w:lvl w:ilvl="3" w:tentative="1">
+      <w:start w:val="1"/>
+      <w:numFmt w:val="bullet"/>
+      <w:lvlText w:val=""/>
+      <w:lvlJc w:val="left"/>
+      <w:pPr>
+        <w:tabs>
+          <w:tab w:val="num" w:pos="2880"/>
+        </w:tabs>
+        <w:ind w:left="2880" w:hanging="360"/>
+      </w:pPr>
+      <w:rPr>
+        <w:rFonts w:ascii="Wingdings" w:hAnsi="Wingdings" w:hint="default"/>
+        <w:sz w:val="20"/>
+      </w:rPr>
+    </w:lvl>
+    <w:lvl w:ilvl="4" w:tentative="1">
+      <w:start w:val="1"/>
+      <w:numFmt w:val="bullet"/>
+      <w:lvlText w:val=""/>
+      <w:lvlJc w:val="left"/>
+      <w:pPr>
+        <w:tabs>
+          <w:tab w:val="num" w:pos="3600"/>
+        </w:tabs>
+        <w:ind w:left="3600" w:hanging="360"/>
+      </w:pPr>
+      <w:rPr>
+        <w:rFonts w:ascii="Wingdings" w:hAnsi="Wingdings" w:hint="default"/>
+        <w:sz w:val="20"/>
+      </w:rPr>
+    </w:lvl>
+    <w:lvl w:ilvl="5" w:tentative="1">
+      <w:start w:val="1"/>
+      <w:numFmt w:val="bullet"/>
+      <w:lvlText w:val=""/>
+      <w:lvlJc w:val="left"/>
+      <w:pPr>
+        <w:tabs>
+          <w:tab w:val="num" w:pos="4320"/>
+        </w:tabs>
+        <w:ind w:left="4320" w:hanging="360"/>
+      </w:pPr>
+      <w:rPr>
+        <w:rFonts w:ascii="Wingdings" w:hAnsi="Wingdings" w:hint="default"/>
+        <w:sz w:val="20"/>
+      </w:rPr>
+    </w:lvl>
+    <w:lvl w:ilvl="6" w:tentative="1">
+      <w:start w:val="1"/>
+      <w:numFmt w:val="bullet"/>
+      <w:lvlText w:val=""/>
+      <w:lvlJc w:val="left"/>
+      <w:pPr>
+        <w:tabs>
+          <w:tab w:val="num" w:pos="5040"/>
+        </w:tabs>
+        <w:ind w:left="5040" w:hanging="360"/>
+      </w:pPr>
+      <w:rPr>
+        <w:rFonts w:ascii="Wingdings" w:hAnsi="Wingdings" w:hint="default"/>
+        <w:sz w:val="20"/>
+      </w:rPr>
+    </w:lvl>
+    <w:lvl w:ilvl="7" w:tentative="1">
+      <w:start w:val="1"/>
+      <w:numFmt w:val="bullet"/>
+      <w:lvlText w:val=""/>
+      <w:lvlJc w:val="left"/>
+      <w:pPr>
+        <w:tabs>
+          <w:tab w:val="num" w:pos="5760"/>
+        </w:tabs>
+        <w:ind w:left="5760" w:hanging="360"/>
+      </w:pPr>
+      <w:rPr>
+        <w:rFonts w:ascii="Wingdings" w:hAnsi="Wingdings" w:hint="default"/>
+        <w:sz w:val="20"/>
+      </w:rPr>
+    </w:lvl>
+    <w:lvl w:ilvl="8" w:tentative="1">
+      <w:start w:val="1"/>
+      <w:numFmt w:val="bullet"/>
+      <w:lvlText w:val=""/>
+      <w:lvlJc w:val="left"/>
+      <w:pPr>
+        <w:tabs>
+          <w:tab w:val="num" w:pos="6480"/>
+        </w:tabs>
+        <w:ind w:left="6480" w:hanging="360"/>
+      </w:pPr>
+      <w:rPr>
+        <w:rFonts w:ascii="Wingdings" w:hAnsi="Wingdings" w:hint="default"/>
+        <w:sz w:val="20"/>
+      </w:rPr>
+    </w:lvl>
+  </w:abstractNum>
+  <w:abstractNum w:abstractNumId="15" w15:restartNumberingAfterBreak="0">
     <w:nsid w:val="5C0E3DEC"/>
     <w:multiLevelType w:val="multilevel"/>
     <w:tmpl w:val="C12C4DF2"/>
@@ -13741,7 +14750,7 @@
       </w:pPr>
     </w:lvl>
   </w:abstractNum>
-  <w:abstractNum w:abstractNumId="15" w15:restartNumberingAfterBreak="0">
+  <w:abstractNum w:abstractNumId="16" w15:restartNumberingAfterBreak="0">
     <w:nsid w:val="66F06477"/>
     <w:multiLevelType w:val="multilevel"/>
     <w:tmpl w:val="99A4BDD2"/>
@@ -13828,7 +14837,7 @@
       </w:pPr>
     </w:lvl>
   </w:abstractNum>
-  <w:abstractNum w:abstractNumId="16" w15:restartNumberingAfterBreak="0">
+  <w:abstractNum w:abstractNumId="17" w15:restartNumberingAfterBreak="0">
     <w:nsid w:val="67805EE7"/>
     <w:multiLevelType w:val="multilevel"/>
     <w:tmpl w:val="5392A388"/>
@@ -13914,7 +14923,120 @@
       </w:pPr>
     </w:lvl>
   </w:abstractNum>
-  <w:abstractNum w:abstractNumId="17" w15:restartNumberingAfterBreak="0">
+  <w:abstractNum w:abstractNumId="18" w15:restartNumberingAfterBreak="0">
+    <w:nsid w:val="6F88725E"/>
+    <w:multiLevelType w:val="hybridMultilevel"/>
+    <w:tmpl w:val="B78051D0"/>
+    <w:lvl w:ilvl="0" w:tplc="04090001">
+      <w:start w:val="1"/>
+      <w:numFmt w:val="bullet"/>
+      <w:lvlText w:val=""/>
+      <w:lvlJc w:val="left"/>
+      <w:pPr>
+        <w:ind w:left="1080" w:hanging="360"/>
+      </w:pPr>
+      <w:rPr>
+        <w:rFonts w:ascii="Symbol" w:hAnsi="Symbol" w:hint="default"/>
+      </w:rPr>
+    </w:lvl>
+    <w:lvl w:ilvl="1" w:tplc="04090003" w:tentative="1">
+      <w:start w:val="1"/>
+      <w:numFmt w:val="bullet"/>
+      <w:lvlText w:val="o"/>
+      <w:lvlJc w:val="left"/>
+      <w:pPr>
+        <w:ind w:left="1800" w:hanging="360"/>
+      </w:pPr>
+      <w:rPr>
+        <w:rFonts w:ascii="Courier New" w:hAnsi="Courier New" w:hint="default"/>
+      </w:rPr>
+    </w:lvl>
+    <w:lvl w:ilvl="2" w:tplc="04090005" w:tentative="1">
+      <w:start w:val="1"/>
+      <w:numFmt w:val="bullet"/>
+      <w:lvlText w:val=""/>
+      <w:lvlJc w:val="left"/>
+      <w:pPr>
+        <w:ind w:left="2520" w:hanging="360"/>
+      </w:pPr>
+      <w:rPr>
+        <w:rFonts w:ascii="Wingdings" w:hAnsi="Wingdings" w:hint="default"/>
+      </w:rPr>
+    </w:lvl>
+    <w:lvl w:ilvl="3" w:tplc="04090001" w:tentative="1">
+      <w:start w:val="1"/>
+      <w:numFmt w:val="bullet"/>
+      <w:lvlText w:val=""/>
+      <w:lvlJc w:val="left"/>
+      <w:pPr>
+        <w:ind w:left="3240" w:hanging="360"/>
+      </w:pPr>
+      <w:rPr>
+        <w:rFonts w:ascii="Symbol" w:hAnsi="Symbol" w:hint="default"/>
+      </w:rPr>
+    </w:lvl>
+    <w:lvl w:ilvl="4" w:tplc="04090003" w:tentative="1">
+      <w:start w:val="1"/>
+      <w:numFmt w:val="bullet"/>
+      <w:lvlText w:val="o"/>
+      <w:lvlJc w:val="left"/>
+      <w:pPr>
+        <w:ind w:left="3960" w:hanging="360"/>
+      </w:pPr>
+      <w:rPr>
+        <w:rFonts w:ascii="Courier New" w:hAnsi="Courier New" w:hint="default"/>
+      </w:rPr>
+    </w:lvl>
+    <w:lvl w:ilvl="5" w:tplc="04090005" w:tentative="1">
+      <w:start w:val="1"/>
+      <w:numFmt w:val="bullet"/>
+      <w:lvlText w:val=""/>
+      <w:lvlJc w:val="left"/>
+      <w:pPr>
+        <w:ind w:left="4680" w:hanging="360"/>
+      </w:pPr>
+      <w:rPr>
+        <w:rFonts w:ascii="Wingdings" w:hAnsi="Wingdings" w:hint="default"/>
+      </w:rPr>
+    </w:lvl>
+    <w:lvl w:ilvl="6" w:tplc="04090001" w:tentative="1">
+      <w:start w:val="1"/>
+      <w:numFmt w:val="bullet"/>
+      <w:lvlText w:val=""/>
+      <w:lvlJc w:val="left"/>
+      <w:pPr>
+        <w:ind w:left="5400" w:hanging="360"/>
+      </w:pPr>
+      <w:rPr>
+        <w:rFonts w:ascii="Symbol" w:hAnsi="Symbol" w:hint="default"/>
+      </w:rPr>
+    </w:lvl>
+    <w:lvl w:ilvl="7" w:tplc="04090003" w:tentative="1">
+      <w:start w:val="1"/>
+      <w:numFmt w:val="bullet"/>
+      <w:lvlText w:val="o"/>
+      <w:lvlJc w:val="left"/>
+      <w:pPr>
+        <w:ind w:left="6120" w:hanging="360"/>
+      </w:pPr>
+      <w:rPr>
+        <w:rFonts w:ascii="Courier New" w:hAnsi="Courier New" w:hint="default"/>
+      </w:rPr>
+    </w:lvl>
+    <w:lvl w:ilvl="8" w:tplc="04090005" w:tentative="1">
+      <w:start w:val="1"/>
+      <w:numFmt w:val="bullet"/>
+      <w:lvlText w:val=""/>
+      <w:lvlJc w:val="left"/>
+      <w:pPr>
+        <w:ind w:left="6840" w:hanging="360"/>
+      </w:pPr>
+      <w:rPr>
+        <w:rFonts w:ascii="Wingdings" w:hAnsi="Wingdings" w:hint="default"/>
+      </w:rPr>
+    </w:lvl>
+  </w:abstractNum>
+  <w:abstractNum w:abstractNumId="19" w15:restartNumberingAfterBreak="0">
     <w:nsid w:val="7FB87924"/>
     <w:multiLevelType w:val="multilevel"/>
     <w:tmpl w:val="1DE8A83C"/>
@@ -14329,13 +15451,13 @@
     <w:abstractNumId w:val="10"/>
   </w:num>
   <w:num w:numId="47" w16cid:durableId="1262300028">
-    <w:abstractNumId w:val="16"/>
+    <w:abstractNumId w:val="17"/>
   </w:num>
   <w:num w:numId="48" w16cid:durableId="871071521">
-    <w:abstractNumId w:val="17"/>
+    <w:abstractNumId w:val="19"/>
   </w:num>
   <w:num w:numId="49" w16cid:durableId="1668558958">
-    <w:abstractNumId w:val="16"/>
+    <w:abstractNumId w:val="17"/>
     <w:lvlOverride w:ilvl="0">
       <w:startOverride w:val="1"/>
     </w:lvlOverride>
@@ -14347,10 +15469,16 @@
     <w:abstractNumId w:val="12"/>
   </w:num>
   <w:num w:numId="52" w16cid:durableId="1605919929">
+    <w:abstractNumId w:val="15"/>
+  </w:num>
+  <w:num w:numId="53" w16cid:durableId="2129201581">
+    <w:abstractNumId w:val="16"/>
+  </w:num>
+  <w:num w:numId="54" w16cid:durableId="1146705459">
     <w:abstractNumId w:val="14"/>
   </w:num>
-  <w:num w:numId="53" w16cid:durableId="2129201581">
-    <w:abstractNumId w:val="15"/>
+  <w:num w:numId="55" w16cid:durableId="1670673294">
+    <w:abstractNumId w:val="18"/>
   </w:num>
 </w:numbering>
 </file>
@@ -26445,6 +27573,24 @@
       </w:numPr>
     </w:pPr>
   </w:style>
+  <w:style w:type="paragraph" w:customStyle="1" w:styleId="md-end-block">
+    <w:name w:val="md-end-block"/>
+    <w:basedOn w:val="Normal"/>
+    <w:rsid w:val="008B4A09"/>
+    <w:pPr>
+      <w:spacing w:before="100" w:beforeAutospacing="1" w:after="100" w:afterAutospacing="1" w:line="240" w:lineRule="auto"/>
+    </w:pPr>
+    <w:rPr>
+      <w:rFonts w:ascii="Times New Roman" w:eastAsia="Times New Roman" w:hAnsi="Times New Roman" w:cs="Times New Roman"/>
+      <w:color w:val="auto"/>
+      <w:szCs w:val="24"/>
+    </w:rPr>
+  </w:style>
+  <w:style w:type="character" w:customStyle="1" w:styleId="md-plain">
+    <w:name w:val="md-plain"/>
+    <w:basedOn w:val="DefaultParagraphFont"/>
+    <w:rsid w:val="008B4A09"/>
+  </w:style>
 </w:styles>
 </file>
 

</xml_diff>